<commit_message>
User guide (EN): accuracy audit against code - correct page texts (filters, definitions, chart contents)
Co-Authored-By: Claude Sonnet 5.5 <noreply@anthropic.com>
Claude-Session: https://claude.ai/code/session_019dELNUNjVMr3Ja2mUwBrCu
</commit_message>
<xml_diff>
--- a/docs/user-guide/en/pages/00a-cheatsheet.docx
+++ b/docs/user-guide/en/pages/00a-cheatsheet.docx
@@ -22,7 +22,7 @@
           <w:sz w:val="21"/>
           <w:szCs w:val="21"/>
         </w:rPr>
-        <w:t xml:space="preserve">One line per page: what it is for, and what to look at first. Most pages have filters at the top (period, store, Operation Manager, Operation Consultant, and so on), and every page has a red "Page Guide" button at the top right that explains the page.</w:t>
+        <w:t xml:space="preserve">One line per page: what it is for, and what to look at first. Most pages have filters at the top (period, store, Operation Manager, Operation Consultant, and so on), and almost every page has a red lightbulb "Page Guide" button at the top right that explains the page.</w:t>
       </w:r>
     </w:p>
     <w:tbl>
@@ -1159,7 +1159,7 @@
                 <w:sz w:val="19"/>
                 <w:szCs w:val="19"/>
               </w:rPr>
-              <w:t xml:space="preserve">Turnover rate, flagged leaders</w:t>
+              <w:t xml:space="preserve">Turnover rate, Above Average leaders, flagged consultants/managers</w:t>
             </w:r>
           </w:p>
         </w:tc>
@@ -1223,7 +1223,7 @@
                 <w:sz w:val="19"/>
                 <w:szCs w:val="19"/>
               </w:rPr>
-              <w:t xml:space="preserve">Follow stores with an open Action Plan</w:t>
+              <w:t xml:space="preserve">Follow store health and open Action Plans</w:t>
             </w:r>
           </w:p>
         </w:tc>
@@ -1252,7 +1252,7 @@
                 <w:sz w:val="19"/>
                 <w:szCs w:val="19"/>
               </w:rPr>
-              <w:t xml:space="preserve">Critical stores, severity, stalled plans</w:t>
+              <w:t xml:space="preserve">Critical stores, tier, stalled plans</w:t>
             </w:r>
           </w:p>
         </w:tc>
@@ -1482,7 +1482,7 @@
           <w:sz w:val="21"/>
           <w:szCs w:val="21"/>
         </w:rPr>
-        <w:t xml:space="preserve">Pick a store, manager or consultant in the filters and every chart and table on the page follows your choice.</w:t>
+        <w:t xml:space="preserve">On pages that have filters, pick a store, manager or consultant and the charts and tables on that page follow your choice.</w:t>
       </w:r>
     </w:p>
     <w:p>
@@ -1501,7 +1501,7 @@
           <w:sz w:val="21"/>
           <w:szCs w:val="21"/>
         </w:rPr>
-        <w:t xml:space="preserve">Click a column header in a table to sort it (click again to reverse).</w:t>
+        <w:t xml:space="preserve">Where a table column header shows a sort arrow, click it to sort (click again to reverse).</w:t>
       </w:r>
     </w:p>
     <w:p>

</xml_diff>

<commit_message>
User guide: accuracy audit against code + fix contradicting in-portal help texts (#84)
* User guide (EN): accuracy audit against code - correct page texts (filters, definitions, chart contents)

Co-Authored-By: Claude Sonnet 5.5 <noreply@anthropic.com>
Claude-Session: https://claude.ai/code/session_019dELNUNjVMr3Ja2mUwBrCu

* Fix in-portal help texts that contradicted the code (Retention, Early Warning, EN+AR) and sync guide content sources with the corrected Word pages

Co-Authored-By: Claude Sonnet 5.5 <noreply@anthropic.com>
Claude-Session: https://claude.ai/code/session_019dELNUNjVMr3Ja2mUwBrCu

---------

Co-authored-by: Claude <noreply@anthropic.com>
</commit_message>
<xml_diff>
--- a/docs/user-guide/en/pages/00a-cheatsheet.docx
+++ b/docs/user-guide/en/pages/00a-cheatsheet.docx
@@ -22,7 +22,7 @@
           <w:sz w:val="21"/>
           <w:szCs w:val="21"/>
         </w:rPr>
-        <w:t xml:space="preserve">One line per page: what it is for, and what to look at first. Most pages have filters at the top (period, store, Operation Manager, Operation Consultant, and so on), and every page has a red "Page Guide" button at the top right that explains the page.</w:t>
+        <w:t xml:space="preserve">One line per page: what it is for, and what to look at first. Most pages have filters at the top (period, store, Operation Manager, Operation Consultant, and so on), and almost every page has a red lightbulb "Page Guide" button at the top right that explains the page.</w:t>
       </w:r>
     </w:p>
     <w:tbl>
@@ -1159,7 +1159,7 @@
                 <w:sz w:val="19"/>
                 <w:szCs w:val="19"/>
               </w:rPr>
-              <w:t xml:space="preserve">Turnover rate, flagged leaders</w:t>
+              <w:t xml:space="preserve">Turnover rate, Above Average leaders, flagged consultants/managers</w:t>
             </w:r>
           </w:p>
         </w:tc>
@@ -1223,7 +1223,7 @@
                 <w:sz w:val="19"/>
                 <w:szCs w:val="19"/>
               </w:rPr>
-              <w:t xml:space="preserve">Follow stores with an open Action Plan</w:t>
+              <w:t xml:space="preserve">Follow store health and open Action Plans</w:t>
             </w:r>
           </w:p>
         </w:tc>
@@ -1252,7 +1252,7 @@
                 <w:sz w:val="19"/>
                 <w:szCs w:val="19"/>
               </w:rPr>
-              <w:t xml:space="preserve">Critical stores, severity, stalled plans</w:t>
+              <w:t xml:space="preserve">Critical stores, tier, stalled plans</w:t>
             </w:r>
           </w:p>
         </w:tc>
@@ -1482,7 +1482,7 @@
           <w:sz w:val="21"/>
           <w:szCs w:val="21"/>
         </w:rPr>
-        <w:t xml:space="preserve">Pick a store, manager or consultant in the filters and every chart and table on the page follows your choice.</w:t>
+        <w:t xml:space="preserve">On pages that have filters, pick a store, manager or consultant and the charts and tables on that page follow your choice.</w:t>
       </w:r>
     </w:p>
     <w:p>
@@ -1501,7 +1501,7 @@
           <w:sz w:val="21"/>
           <w:szCs w:val="21"/>
         </w:rPr>
-        <w:t xml:space="preserve">Click a column header in a table to sort it (click again to reverse).</w:t>
+        <w:t xml:space="preserve">Where a table column header shows a sort arrow, click it to sort (click again to reverse).</w:t>
       </w:r>
     </w:p>
     <w:p>

</xml_diff>